<commit_message>
docs: incorporate updated WAHS collaboration notes
</commit_message>
<xml_diff>
--- a/landing/wahs/WAHS-OpenClinAI-Design-Report.docx
+++ b/landing/wahs/WAHS-OpenClinAI-Design-Report.docx
@@ -953,7 +953,7 @@
         <w:rPr>
           <w:rtl w:val="0"/>
         </w:rPr>
-        <w:t xml:space="preserve">Start with a small read-only review pilot using fictional examples. A person inspects AI conflict flags and records a decision. QueryStore, the evaluation harness and Med Agent Hub are useful options where their existing behavior fits the chosen source and task.</w:t>
+        <w:t xml:space="preserve">Start with a small read-only review pilot using fictional examples. A person inspects AI conflict flags and records a decision. Source-linked question answering or displaying incoming AI history are alternative small starts if WAHS needs them sooner.</w:t>
       </w:r>
     </w:p>
     <w:bookmarkStart w:colFirst="0" w:colLast="0" w:name="bookmark=id.1sqjewf8afxt" w:id="2"/>
@@ -1096,7 +1096,7 @@
           <w:vertAlign w:val="baseline"/>
           <w:rtl w:val="0"/>
         </w:rPr>
-        <w:t xml:space="preserve">Use shared tools to inspect errors, corrections and unresolved disagreements.</w:t>
+        <w:t xml:space="preserve">Use shared testing to inspect errors and compare models on the same cases.</w:t>
       </w:r>
     </w:p>
     <w:bookmarkStart w:colFirst="0" w:colLast="0" w:name="bookmark=id.4t4jj91ycfx" w:id="3"/>
@@ -1121,7 +1121,7 @@
         <w:rPr>
           <w:rtl w:val="0"/>
         </w:rPr>
-        <w:t xml:space="preserve">WAHS discussions identify conflicting records, summaries for sharing and clear AI attribution as opportunities. The meeting also asks how to choose models, manage input size and assess usefulness. These remain design questions. [1]</w:t>
+        <w:t xml:space="preserve">Updated WAHS notes cover conflicting records, sharing summaries, question-based search and AI attribution. They add record preparation, local models, shared computing and a later multilingual discussion. These are opportunities and open choices. [1]</w:t>
       </w:r>
     </w:p>
     <w:p>
@@ -1158,7 +1158,7 @@
         <w:rPr>
           <w:rtl w:val="0"/>
         </w:rPr>
-        <w:t xml:space="preserve">ChartSearchAI shows supporting chart records. The AI Transparency on FHIR guide adds a way to share which AI helped produce a result, what it affected and what human involvement was recorded. Existing references alone do not establish that compatibility. [2, 3]</w:t>
+        <w:t xml:space="preserve">ChartSearchAI links answers to records. The FHIR guide adds history of AI involvement, its extent and human participation. WAHS could produce that history with a summary or display it on incoming data, distinguishing a whole entry from one field. [2, 3]</w:t>
       </w:r>
     </w:p>
     <w:p>
@@ -1181,7 +1181,7 @@
         <w:rPr>
           <w:rtl w:val="0"/>
         </w:rPr>
-        <w:t xml:space="preserve">The discussion suggests fewer than a dozen records per person, but one record may contain many entries. Inspect examples before choosing search or data-processing tools. A simple reader for a few files may be enough to begin.</w:t>
+        <w:t xml:space="preserve">Prepare readable entries with names, values, units, dates and sources intact. Inspect actual case size before adding search. A few complete examples provide a useful comparison for finding out whether selected information hides a disagreement.</w:t>
       </w:r>
     </w:p>
     <w:p>
@@ -1204,7 +1204,7 @@
         <w:rPr>
           <w:rtl w:val="0"/>
         </w:rPr>
-        <w:t xml:space="preserve">QueryStore provides an OpenMRS read interface with source identifiers, dates and version markers. This offers a possible pilot source and a transferable design. A WAHS file reader would need its own implementation. A searchable copy may be incomplete or out of date.</w:t>
+        <w:t xml:space="preserve">QueryStore preserves clinical text, metadata and source identities in a searchable copy. It supports configurable embeddings and word search. The notes name E5; harness defaults name MiniLM. Confirm the active model. Direct WAHS file support remains new work.</w:t>
       </w:r>
     </w:p>
     <w:p>
@@ -1251,7 +1251,7 @@
           <w:vertAlign w:val="baseline"/>
           <w:rtl w:val="0"/>
         </w:rPr>
-        <w:t xml:space="preserve">Key takeaway. An automated check, a patient statement and a clinician review are separate facts. A source reference or AI label does not by itself establish correctness.</w:t>
+        <w:t xml:space="preserve">Key takeaway. Source references, AI history and human review are separate facts. Neither a search result nor an AI label establishes correctness or completeness.</w:t>
       </w:r>
       <w:r>
         <w:rPr>
@@ -1309,7 +1309,7 @@
         <w:rPr>
           <w:rtl w:val="0"/>
         </w:rPr>
-        <w:t xml:space="preserve">Methods and review design can transfer immediately. Shared testing needs a small runner. Direct integration should follow only when the source data and workflow justify it.</w:t>
+        <w:t xml:space="preserve">Methods and review design transfer immediately. Shared testing needs a small runner. Local hosting, model settings and any direct data connection need task-specific checks.</w:t>
       </w:r>
     </w:p>
     <w:tbl>
@@ -2160,7 +2160,7 @@
         <w:rPr>
           <w:rtl w:val="0"/>
         </w:rPr>
-        <w:t xml:space="preserve">Proposed first pilot: a read-only review bench for fictional medication histories. Preserve originals and record reviewer decisions separately. Set a timebox once examples and reviewers are available.</w:t>
+        <w:t xml:space="preserve">Proposed first pilot: fictional medication histories, conflict flags and human review. Preserve originals and save reviewer decisions separately. Confirm priority against the search and connectathon display opportunities.</w:t>
       </w:r>
     </w:p>
     <w:p>
@@ -2327,7 +2327,7 @@
           <w:vertAlign w:val="baseline"/>
           <w:rtl w:val="0"/>
         </w:rPr>
-        <w:t xml:space="preserve">Review together. Inspect missed disagreements, mistaken flags and useful corrections. Decide whether to improve the cases, revise instructions or connect WAHS data. A small pilot does not establish clinical safety.</w:t>
+        <w:t xml:space="preserve">Review together. Inspect missed disagreements, mistaken flags and useful corrections. Then choose better cases, instructions, a data connection or another model. A small pilot does not establish clinical safety.</w:t>
       </w:r>
       <w:r>
         <w:rPr>
@@ -2371,18 +2371,18 @@
         <w:rPr>
           <w:rtl w:val="0"/>
         </w:rPr>
-        <w:t xml:space="preserve">WAHS could provide useful cases for studying information selection, individual decisions, human control and small local models. The general Hub endpoint runs model calls; the richer Catalyst request records are specific to its query path. A WAHS runner must capture its own evidence.</w:t>
-      </w:r>
-    </w:p>
-    <w:p>
-      <w:pPr>
-        <w:rPr/>
-      </w:pPr>
-      <w:r>
-        <w:rPr>
-          <w:rtl w:val="0"/>
-        </w:rPr>
-        <w:t xml:space="preserve">The dissertation focuses on adapting WHO SMART Guidelines for HIV care. WAHS could test whether methods transfer to another setting. A publishable study needs its own questions, comparison design and literature review. [4]</w:t>
+        <w:t xml:space="preserve">Research could compare full versus selected records, fixed steps versus model-requested tools, human control and small local models. Hub supports selected settings and bounded tool use. GPU availability, disconnected use and multilingual performance remain unverified.</w:t>
+      </w:r>
+    </w:p>
+    <w:p>
+      <w:pPr>
+        <w:rPr/>
+      </w:pPr>
+      <w:r>
+        <w:rPr>
+          <w:rtl w:val="0"/>
+        </w:rPr>
+        <w:t xml:space="preserve">The dissertation focuses on WHO SMART Guidelines for HIV care. WAHS offers another setting for its methods. A study needs its own questions and comparison design. CNICS was discussed as future data; this pilot uses fictional cases. [4]</w:t>
       </w:r>
     </w:p>
     <w:bookmarkStart w:colFirst="0" w:colLast="0" w:name="bookmark=id.cf45595vup8a" w:id="8"/>
@@ -2422,18 +2422,18 @@
         <w:rPr>
           <w:rtl w:val="0"/>
         </w:rPr>
-        <w:t xml:space="preserve">Reviewed sources include the meeting and supplied transcript, Hub and QueryStore code pinned by the harness, and private research plans. Meeting and research links require team access. Connectathon criteria came from the supplied excerpt; its page could not be fetched.</w:t>
-      </w:r>
-    </w:p>
-    <w:p>
-      <w:pPr>
-        <w:rPr/>
-      </w:pPr>
-      <w:r>
-        <w:rPr>
-          <w:rtl w:val="0"/>
-        </w:rPr>
-        <w:t xml:space="preserve">UX research supports a clear overview, optional detail and easy correction. The browser report separates methods from software reuse and labels proposals. Its design has not been tested with patients. [5]</w:t>
+        <w:t xml:space="preserve">Reviewed sources include the meeting, transcript, updated notes, selected code revisions and research plans. Reported GPU provisioning and deployment accounts were not independently verified. Connectathon criteria came from the supplied excerpt.</w:t>
+      </w:r>
+    </w:p>
+    <w:p>
+      <w:pPr>
+        <w:rPr/>
+      </w:pPr>
+      <w:r>
+        <w:rPr>
+          <w:rtl w:val="0"/>
+        </w:rPr>
+        <w:t xml:space="preserve">The browser report adds search, model and computing details with expandable sources. E5 is documented for English; multilingual use needs separate testing. Catalyst’s cited roadmap defines generic SQL, with Spark as a reference setup still to implement. [2, 5]</w:t>
       </w:r>
     </w:p>
     <w:bookmarkStart w:colFirst="0" w:colLast="0" w:name="bookmark=id.nnk1eebni0ji" w:id="10"/>
@@ -2491,7 +2491,7 @@
             <w:vertAlign w:val="baseline"/>
             <w:rtl w:val="0"/>
           </w:rPr>
-          <w:t xml:space="preserve">[1] WAHS. EHI meeting notes, 24 August 2026, version 5. Updated 1 September 2026.</w:t>
+          <w:t xml:space="preserve">[1] WAHS. EHI meeting notes, version 5, updated 1 September 2026; transcript and updated discussion notes supplied 9 September.</w:t>
         </w:r>
       </w:hyperlink>
     </w:p>
@@ -2702,7 +2702,7 @@
             <w:vertAlign w:val="baseline"/>
             <w:rtl w:val="0"/>
           </w:rPr>
-          <w:t xml:space="preserve">[5] Design guidance. Nielsen Norman Group on progressive disclosure; Microsoft HAX on correction; USWDS and W3C on accessible reading. Full report: wahs.openclinai.org.</w:t>
+          <w:t xml:space="preserve">[5] Model, computing and design sources: E5 model card, NVIDIA H200 profiles, NN/g, Microsoft HAX, USWDS and W3C. Full evidence and links: wahs.openclinai.org.</w:t>
         </w:r>
         <w:r>
           <w:rPr>

</xml_diff>

<commit_message>
docs: present WAHS pilots as concise discussion abstracts
</commit_message>
<xml_diff>
--- a/landing/wahs/WAHS-OpenClinAI-Design-Report.docx
+++ b/landing/wahs/WAHS-OpenClinAI-Design-Report.docx
@@ -197,7 +197,7 @@
                 <w:color w:val="666666"/>
                 <w:rtl w:val="0"/>
               </w:rPr>
-              <w:t xml:space="preserve">Methods, shared tools and a first review pilot</w:t>
+              <w:t xml:space="preserve">Methods, shared tools and pilot ideas</w:t>
             </w:r>
           </w:p>
         </w:tc>
@@ -953,7 +953,7 @@
         <w:rPr>
           <w:rtl w:val="0"/>
         </w:rPr>
-        <w:t xml:space="preserve">Start with a small read-only review pilot using fictional examples. A person inspects AI conflict flags and records a decision. Source-linked question answering or displaying incoming AI history are alternative small starts if WAHS needs them sooner.</w:t>
+        <w:t xml:space="preserve">Three short pilot abstracts offer starting points: help people review conflicting entries, answer questions with supporting records, or display incoming AI history. Each could begin with a shared review of examples. No delivery plan or implementation commitment is proposed.</w:t>
       </w:r>
     </w:p>
     <w:bookmarkStart w:colFirst="0" w:colLast="0" w:name="bookmark=id.1sqjewf8afxt" w:id="2"/>
@@ -1096,7 +1096,7 @@
           <w:vertAlign w:val="baseline"/>
           <w:rtl w:val="0"/>
         </w:rPr>
-        <w:t xml:space="preserve">Use shared testing to inspect errors and compare models on the same cases.</w:t>
+        <w:t xml:space="preserve">Explore a focused question with shared examples and optional testing tools.</w:t>
       </w:r>
     </w:p>
     <w:bookmarkStart w:colFirst="0" w:colLast="0" w:name="bookmark=id.4t4jj91ycfx" w:id="3"/>
@@ -1132,7 +1132,7 @@
         <w:rPr>
           <w:rtl w:val="0"/>
         </w:rPr>
-        <w:t xml:space="preserve">This report connects those needs to reviewed OpenClinAI and QueryStore code and the research programme. The pilot is proposed; it has not been run. WAHS implementation code and representative patient exports were not inspected.</w:t>
+        <w:t xml:space="preserve">This report connects WAHS needs to reviewed OpenClinAI and QueryStore code and the research programme. The pilot abstracts are discussion ideas. WAHS implementation code and representative patient exports were not inspected.</w:t>
       </w:r>
     </w:p>
     <w:bookmarkStart w:colFirst="0" w:colLast="0" w:name="bookmark=id.xx7bxdemqiq" w:id="4"/>
@@ -2160,7 +2160,7 @@
         <w:rPr>
           <w:rtl w:val="0"/>
         </w:rPr>
-        <w:t xml:space="preserve">Proposed first pilot: fictional medication histories, conflict flags and human review. Preserve originals and save reviewer decisions separately. Confirm priority against the search and connectathon display opportunities.</w:t>
+        <w:t xml:space="preserve">Three possible pilots are outlined below. Each can begin with a few fictional examples or a partner demonstration. Choose an interesting question before agreeing effort, tools or implementation.</w:t>
       </w:r>
     </w:p>
     <w:p>
@@ -2203,7 +2203,7 @@
           <w:vertAlign w:val="baseline"/>
           <w:rtl w:val="0"/>
         </w:rPr>
-        <w:t xml:space="preserve">Agree a few cases. Include a duplicate, a real change over time, a disagreement, a missing date and a patient correction. Record what should be flagged and what must remain unresolved.</w:t>
+        <w:t xml:space="preserve">Review conflicting entries. Show original medication records beside AI flags. Learn which flags help, what is missed and where human knowledge changes the interpretation. Apply source-based review and Catalyst’s inspect-before-action approach.</w:t>
       </w:r>
       <w:r>
         <w:rPr>
@@ -2265,7 +2265,7 @@
           <w:vertAlign w:val="baseline"/>
           <w:rtl w:val="0"/>
         </w:rPr>
-        <w:t xml:space="preserve">Run and inspect. A small harness runner reads cases, calls one model through Hub and records inputs, outputs and errors. Use QueryStore directly only for an OpenMRS test source.</w:t>
+        <w:t xml:space="preserve">Find records behind answers. Ask questions about a few examples and open supporting entries. Learn whether search finds the right information or hides something relevant. Apply ChartSearchAI and QueryStore experience, with optional shared evaluation tools.</w:t>
       </w:r>
       <w:r>
         <w:rPr>
@@ -2327,7 +2327,7 @@
           <w:vertAlign w:val="baseline"/>
           <w:rtl w:val="0"/>
         </w:rPr>
-        <w:t xml:space="preserve">Review together. Inspect missed disagreements, mistaken flags and useful corrections. Then choose better cases, instructions, a data connection or another model. A small pilot does not establish clinical safety.</w:t>
+        <w:t xml:space="preserve">Display incoming AI history. Explore a partner example showing AI involvement, its extent and human review. Distinguish whole-entry and field labels. Learn whether readers understand the supplied connectathon facts without inspecting raw data.</w:t>
       </w:r>
       <w:r>
         <w:rPr>
@@ -2371,18 +2371,18 @@
         <w:rPr>
           <w:rtl w:val="0"/>
         </w:rPr>
-        <w:t xml:space="preserve">Research could compare full versus selected records, fixed steps versus model-requested tools, human control and small local models. Hub supports selected settings and bounded tool use. GPU availability, disconnected use and multilingual performance remain unverified.</w:t>
-      </w:r>
-    </w:p>
-    <w:p>
-      <w:pPr>
-        <w:rPr/>
-      </w:pPr>
-      <w:r>
-        <w:rPr>
-          <w:rtl w:val="0"/>
-        </w:rPr>
-        <w:t xml:space="preserve">The dissertation focuses on WHO SMART Guidelines for HIV care. WAHS offers another setting for its methods. A study needs its own questions and comparison design. CNICS was discussed as future data; this pilot uses fictional cases. [4]</w:t>
+        <w:t xml:space="preserve">These ideas could inform research on information selection, individual decisions, human control and small local models. Begin by identifying an example, a workflow reviewer and a question worth testing. Using shared code is optional.</w:t>
+      </w:r>
+    </w:p>
+    <w:p>
+      <w:pPr>
+        <w:rPr/>
+      </w:pPr>
+      <w:r>
+        <w:rPr>
+          <w:rtl w:val="0"/>
+        </w:rPr>
+        <w:t xml:space="preserve">The dissertation focuses on WHO SMART Guidelines for HIV care. WAHS offers another setting for its methods. A study needs its own questions and comparison design. Local computing and multilingual work can follow the chosen question. [4]</w:t>
       </w:r>
     </w:p>
     <w:bookmarkStart w:colFirst="0" w:colLast="0" w:name="bookmark=id.cf45595vup8a" w:id="8"/>
@@ -2433,7 +2433,7 @@
         <w:rPr>
           <w:rtl w:val="0"/>
         </w:rPr>
-        <w:t xml:space="preserve">The browser report adds search, model and computing details with expandable sources. E5 is documented for English; multilingual use needs separate testing. Catalyst’s cited roadmap defines generic SQL, with Spark as a reference setup still to implement. [2, 5]</w:t>
+        <w:t xml:space="preserve">The browser report includes expandable search, model and computing sources. E5 is documented for English; multilingual use needs testing. Catalyst’s roadmap defines generic SQL; the public site also presents a newer FHIR and Spark demonstration. Its deployed revision was not matched here. [2, 5]</w:t>
       </w:r>
     </w:p>
     <w:bookmarkStart w:colFirst="0" w:colLast="0" w:name="bookmark=id.nnk1eebni0ji" w:id="10"/>

</xml_diff>

<commit_message>
docs: focus WAHS pilot on iterative conflict resolution
</commit_message>
<xml_diff>
--- a/landing/wahs/WAHS-OpenClinAI-Design-Report.docx
+++ b/landing/wahs/WAHS-OpenClinAI-Design-Report.docx
@@ -953,7 +953,7 @@
         <w:rPr>
           <w:rtl w:val="0"/>
         </w:rPr>
-        <w:t xml:space="preserve">Three short pilot abstracts offer starting points: help people review conflicting entries, answer questions with supporting records, or display incoming AI history. Each could begin with a shared review of examples. No delivery plan or implementation commitment is proposed.</w:t>
+        <w:t xml:space="preserve">The lead pilot explores iterative AI-assisted conflict resolution. AI flags a difference and proposes a resolution; a person adds context, challenges assumptions and requests revisions before deciding. Search and AI history are supporting ideas. This is a short proposal for discussion, not a built pilot.</w:t>
       </w:r>
     </w:p>
     <w:bookmarkStart w:colFirst="0" w:colLast="0" w:name="bookmark=id.1sqjewf8afxt" w:id="2"/>
@@ -1053,7 +1053,7 @@
           <w:vertAlign w:val="baseline"/>
           <w:rtl w:val="0"/>
         </w:rPr>
-        <w:t xml:space="preserve">Adapt Catalyst’s review-before-action approach to patient decisions.</w:t>
+        <w:t xml:space="preserve">Adapt Catalyst’s iterative review approach to resolving record conflicts.</w:t>
       </w:r>
     </w:p>
     <w:p>
@@ -1132,7 +1132,7 @@
         <w:rPr>
           <w:rtl w:val="0"/>
         </w:rPr>
-        <w:t xml:space="preserve">This report connects WAHS needs to reviewed OpenClinAI and QueryStore code and the research programme. The pilot abstracts are discussion ideas. WAHS implementation code and representative patient exports were not inspected.</w:t>
+        <w:t xml:space="preserve">This report connects WAHS needs to reviewed OpenClinAI and QueryStore code and the research programme. The pilot remains a discussion proposal. WAHS implementation code and representative patient exports were not inspected.</w:t>
       </w:r>
     </w:p>
     <w:bookmarkStart w:colFirst="0" w:colLast="0" w:name="bookmark=id.xx7bxdemqiq" w:id="4"/>
@@ -1204,7 +1204,7 @@
         <w:rPr>
           <w:rtl w:val="0"/>
         </w:rPr>
-        <w:t xml:space="preserve">QueryStore preserves clinical text, metadata and source identities in a searchable copy. It supports configurable embeddings and word search. The notes name E5; harness defaults name MiniLM. Confirm the active model. Direct WAHS file support remains new work.</w:t>
+        <w:t xml:space="preserve">QueryStore preserves clinical text, metadata and source identities in a searchable copy. Reading originals can remain separate from saving draft resolutions and human decisions. Embedding models are configurable: the notes name E5; harness defaults name MiniLM. Confirm the active model.</w:t>
       </w:r>
     </w:p>
     <w:p>
@@ -2131,7 +2131,7 @@
                 <w:vertAlign w:val="baseline"/>
                 <w:rtl w:val="0"/>
               </w:rPr>
-              <w:t xml:space="preserve">Read-only evaluation pilot</w:t>
+              <w:t xml:space="preserve">Iterative review pilot</w:t>
             </w:r>
           </w:p>
         </w:tc>
@@ -2160,7 +2160,7 @@
         <w:rPr>
           <w:rtl w:val="0"/>
         </w:rPr>
-        <w:t xml:space="preserve">Three possible pilots are outlined below. Each can begin with a few fictional examples or a partner demonstration. Choose an interesting question before agreeing effort, tools or implementation.</w:t>
+        <w:t xml:space="preserve">The lead abstract explores flagging and resolving conflicts through repeated AI and human input. Begin with a few fictional examples. Search and AI history offer two supporting angles; practical scope remains for discussion with WAHS.</w:t>
       </w:r>
     </w:p>
     <w:p>
@@ -2203,7 +2203,7 @@
           <w:vertAlign w:val="baseline"/>
           <w:rtl w:val="0"/>
         </w:rPr>
-        <w:t xml:space="preserve">Review conflicting entries. Show original medication records beside AI flags. Learn which flags help, what is missed and where human knowledge changes the interpretation. Apply source-based review and Catalyst’s inspect-before-action approach.</w:t>
+        <w:t xml:space="preserve">Flag and resolve conflicts together. AI shows a possible conflict and its sources. A person adds context; AI proposes and revises a resolution. The person accepts, edits, rejects or leaves it unresolved. Preserve originals and record the reasoning. Study whether revisions improve resolutions and respect human corrections.</w:t>
       </w:r>
       <w:r>
         <w:rPr>
@@ -2265,7 +2265,7 @@
           <w:vertAlign w:val="baseline"/>
           <w:rtl w:val="0"/>
         </w:rPr>
-        <w:t xml:space="preserve">Find records behind answers. Ask questions about a few examples and open supporting entries. Learn whether search finds the right information or hides something relevant. Apply ChartSearchAI and QueryStore experience, with optional shared evaluation tools.</w:t>
+        <w:t xml:space="preserve">Supporting idea: find records behind answers. Open the entries supporting a suggestion and inspect what search leaves out. Apply ChartSearchAI and QueryStore experience, with optional shared evaluation tools.</w:t>
       </w:r>
       <w:r>
         <w:rPr>
@@ -2327,7 +2327,7 @@
           <w:vertAlign w:val="baseline"/>
           <w:rtl w:val="0"/>
         </w:rPr>
-        <w:t xml:space="preserve">Display incoming AI history. Explore a partner example showing AI involvement, its extent and human review. Distinguish whole-entry and field labels. Learn whether readers understand the supplied connectathon facts without inspecting raw data.</w:t>
+        <w:t xml:space="preserve">Supporting idea: display AI history. Show AI involvement, its extent and human review. Distinguish whole-entry and field labels. Explore whether readers understand that history without inspecting raw data.</w:t>
       </w:r>
       <w:r>
         <w:rPr>
@@ -2371,7 +2371,7 @@
         <w:rPr>
           <w:rtl w:val="0"/>
         </w:rPr>
-        <w:t xml:space="preserve">These ideas could inform research on information selection, individual decisions, human control and small local models. Begin by identifying an example, a workflow reviewer and a question worth testing. Using shared code is optional.</w:t>
+        <w:t xml:space="preserve">The pilot could study how human input changes successive proposals, when AI resolves or introduces a disagreement, and whether rejected suggestions reappear. Our methods transfer even when the pilot uses no OpenClinAI code. Agree implementation after reviewing the abstract with WAHS.</w:t>
       </w:r>
     </w:p>
     <w:p>

</xml_diff>

<commit_message>
docs: focus WAHS pilot on iterative conflict resolution (#107)
Co-authored-by: Piotr Mankowski <pmanko@Piotrs-MacBook-Pro.local>
</commit_message>
<xml_diff>
--- a/landing/wahs/WAHS-OpenClinAI-Design-Report.docx
+++ b/landing/wahs/WAHS-OpenClinAI-Design-Report.docx
@@ -953,7 +953,7 @@
         <w:rPr>
           <w:rtl w:val="0"/>
         </w:rPr>
-        <w:t xml:space="preserve">Three short pilot abstracts offer starting points: help people review conflicting entries, answer questions with supporting records, or display incoming AI history. Each could begin with a shared review of examples. No delivery plan or implementation commitment is proposed.</w:t>
+        <w:t xml:space="preserve">The lead pilot explores iterative AI-assisted conflict resolution. AI flags a difference and proposes a resolution; a person adds context, challenges assumptions and requests revisions before deciding. Search and AI history are supporting ideas. This is a short proposal for discussion, not a built pilot.</w:t>
       </w:r>
     </w:p>
     <w:bookmarkStart w:colFirst="0" w:colLast="0" w:name="bookmark=id.1sqjewf8afxt" w:id="2"/>
@@ -1053,7 +1053,7 @@
           <w:vertAlign w:val="baseline"/>
           <w:rtl w:val="0"/>
         </w:rPr>
-        <w:t xml:space="preserve">Adapt Catalyst’s review-before-action approach to patient decisions.</w:t>
+        <w:t xml:space="preserve">Adapt Catalyst’s iterative review approach to resolving record conflicts.</w:t>
       </w:r>
     </w:p>
     <w:p>
@@ -1132,7 +1132,7 @@
         <w:rPr>
           <w:rtl w:val="0"/>
         </w:rPr>
-        <w:t xml:space="preserve">This report connects WAHS needs to reviewed OpenClinAI and QueryStore code and the research programme. The pilot abstracts are discussion ideas. WAHS implementation code and representative patient exports were not inspected.</w:t>
+        <w:t xml:space="preserve">This report connects WAHS needs to reviewed OpenClinAI and QueryStore code and the research programme. The pilot remains a discussion proposal. WAHS implementation code and representative patient exports were not inspected.</w:t>
       </w:r>
     </w:p>
     <w:bookmarkStart w:colFirst="0" w:colLast="0" w:name="bookmark=id.xx7bxdemqiq" w:id="4"/>
@@ -1204,7 +1204,7 @@
         <w:rPr>
           <w:rtl w:val="0"/>
         </w:rPr>
-        <w:t xml:space="preserve">QueryStore preserves clinical text, metadata and source identities in a searchable copy. It supports configurable embeddings and word search. The notes name E5; harness defaults name MiniLM. Confirm the active model. Direct WAHS file support remains new work.</w:t>
+        <w:t xml:space="preserve">QueryStore preserves clinical text, metadata and source identities in a searchable copy. Reading originals can remain separate from saving draft resolutions and human decisions. Embedding models are configurable: the notes name E5; harness defaults name MiniLM. Confirm the active model.</w:t>
       </w:r>
     </w:p>
     <w:p>
@@ -2131,7 +2131,7 @@
                 <w:vertAlign w:val="baseline"/>
                 <w:rtl w:val="0"/>
               </w:rPr>
-              <w:t xml:space="preserve">Read-only evaluation pilot</w:t>
+              <w:t xml:space="preserve">Iterative review pilot</w:t>
             </w:r>
           </w:p>
         </w:tc>
@@ -2160,7 +2160,7 @@
         <w:rPr>
           <w:rtl w:val="0"/>
         </w:rPr>
-        <w:t xml:space="preserve">Three possible pilots are outlined below. Each can begin with a few fictional examples or a partner demonstration. Choose an interesting question before agreeing effort, tools or implementation.</w:t>
+        <w:t xml:space="preserve">The lead abstract explores flagging and resolving conflicts through repeated AI and human input. Begin with a few fictional examples. Search and AI history offer two supporting angles; practical scope remains for discussion with WAHS.</w:t>
       </w:r>
     </w:p>
     <w:p>
@@ -2203,7 +2203,7 @@
           <w:vertAlign w:val="baseline"/>
           <w:rtl w:val="0"/>
         </w:rPr>
-        <w:t xml:space="preserve">Review conflicting entries. Show original medication records beside AI flags. Learn which flags help, what is missed and where human knowledge changes the interpretation. Apply source-based review and Catalyst’s inspect-before-action approach.</w:t>
+        <w:t xml:space="preserve">Flag and resolve conflicts together. AI shows a possible conflict and its sources. A person adds context; AI proposes and revises a resolution. The person accepts, edits, rejects or leaves it unresolved. Preserve originals and record the reasoning. Study whether revisions improve resolutions and respect human corrections.</w:t>
       </w:r>
       <w:r>
         <w:rPr>
@@ -2265,7 +2265,7 @@
           <w:vertAlign w:val="baseline"/>
           <w:rtl w:val="0"/>
         </w:rPr>
-        <w:t xml:space="preserve">Find records behind answers. Ask questions about a few examples and open supporting entries. Learn whether search finds the right information or hides something relevant. Apply ChartSearchAI and QueryStore experience, with optional shared evaluation tools.</w:t>
+        <w:t xml:space="preserve">Supporting idea: find records behind answers. Open the entries supporting a suggestion and inspect what search leaves out. Apply ChartSearchAI and QueryStore experience, with optional shared evaluation tools.</w:t>
       </w:r>
       <w:r>
         <w:rPr>
@@ -2327,7 +2327,7 @@
           <w:vertAlign w:val="baseline"/>
           <w:rtl w:val="0"/>
         </w:rPr>
-        <w:t xml:space="preserve">Display incoming AI history. Explore a partner example showing AI involvement, its extent and human review. Distinguish whole-entry and field labels. Learn whether readers understand the supplied connectathon facts without inspecting raw data.</w:t>
+        <w:t xml:space="preserve">Supporting idea: display AI history. Show AI involvement, its extent and human review. Distinguish whole-entry and field labels. Explore whether readers understand that history without inspecting raw data.</w:t>
       </w:r>
       <w:r>
         <w:rPr>
@@ -2371,7 +2371,7 @@
         <w:rPr>
           <w:rtl w:val="0"/>
         </w:rPr>
-        <w:t xml:space="preserve">These ideas could inform research on information selection, individual decisions, human control and small local models. Begin by identifying an example, a workflow reviewer and a question worth testing. Using shared code is optional.</w:t>
+        <w:t xml:space="preserve">The pilot could study how human input changes successive proposals, when AI resolves or introduces a disagreement, and whether rejected suggestions reappear. Our methods transfer even when the pilot uses no OpenClinAI code. Agree implementation after reviewing the abstract with WAHS.</w:t>
       </w:r>
     </w:p>
     <w:p>

</xml_diff>